<commit_message>
ADR-07: separar templates y estilos inline en archivos externos
</commit_message>
<xml_diff>
--- a/docs/ADR/ADR-03-service-layer-backend.docx
+++ b/docs/ADR/ADR-03-service-layer-backend.docx
@@ -796,6 +796,9 @@
     </w:p>
     <w:p>
       <w:r>
+        <w:rPr>
+          <w:noProof/>
+        </w:rPr>
         <w:drawing>
           <wp:inline distT="0" distB="0" distL="0" distR="0" wp14:anchorId="355096EF" wp14:editId="6FBB304E">
             <wp:extent cx="4182059" cy="2105319"/>
@@ -1748,6 +1751,9 @@
     </w:p>
     <w:p>
       <w:r>
+        <w:rPr>
+          <w:noProof/>
+        </w:rPr>
         <w:lastRenderedPageBreak/>
         <w:drawing>
           <wp:inline distT="0" distB="0" distL="0" distR="0" wp14:anchorId="441C54FA" wp14:editId="0DF4CB12">
@@ -1788,6 +1794,9 @@
     </w:p>
     <w:p>
       <w:r>
+        <w:rPr>
+          <w:noProof/>
+        </w:rPr>
         <w:drawing>
           <wp:inline distT="0" distB="0" distL="0" distR="0" wp14:anchorId="18127A24" wp14:editId="17E47891">
             <wp:extent cx="5612130" cy="4161790"/>
@@ -1827,6 +1836,9 @@
     </w:p>
     <w:p>
       <w:r>
+        <w:rPr>
+          <w:noProof/>
+        </w:rPr>
         <w:lastRenderedPageBreak/>
         <w:drawing>
           <wp:inline distT="0" distB="0" distL="0" distR="0" wp14:anchorId="48DCF01B" wp14:editId="5EF41A71">
@@ -1876,6 +1888,9 @@
     </w:p>
     <w:p>
       <w:r>
+        <w:rPr>
+          <w:noProof/>
+        </w:rPr>
         <w:drawing>
           <wp:inline distT="0" distB="0" distL="0" distR="0" wp14:anchorId="7F68F9FA" wp14:editId="794AF323">
             <wp:extent cx="5612130" cy="1906270"/>
@@ -1983,6 +1998,9 @@
     </w:p>
     <w:p>
       <w:r>
+        <w:rPr>
+          <w:noProof/>
+        </w:rPr>
         <w:drawing>
           <wp:inline distT="0" distB="0" distL="0" distR="0" wp14:anchorId="0018386E" wp14:editId="3C399394">
             <wp:extent cx="3886742" cy="2305372"/>
@@ -2022,6 +2040,9 @@
     </w:p>
     <w:p>
       <w:r>
+        <w:rPr>
+          <w:noProof/>
+        </w:rPr>
         <w:lastRenderedPageBreak/>
         <w:drawing>
           <wp:inline distT="0" distB="0" distL="0" distR="0" wp14:anchorId="11528388" wp14:editId="258CA238">
@@ -2063,6 +2084,9 @@
         <w:br/>
       </w:r>
       <w:r>
+        <w:rPr>
+          <w:noProof/>
+        </w:rPr>
         <w:drawing>
           <wp:inline distT="0" distB="0" distL="0" distR="0" wp14:anchorId="2B7EC0A2" wp14:editId="38B0C63E">
             <wp:extent cx="5612130" cy="2590800"/>
@@ -2112,6 +2136,9 @@
         <w:br/>
       </w:r>
       <w:r>
+        <w:rPr>
+          <w:noProof/>
+        </w:rPr>
         <w:lastRenderedPageBreak/>
         <w:drawing>
           <wp:inline distT="0" distB="0" distL="0" distR="0" wp14:anchorId="2033F34A" wp14:editId="040924D8">
@@ -2153,6 +2180,9 @@
         <w:br/>
       </w:r>
       <w:r>
+        <w:rPr>
+          <w:noProof/>
+        </w:rPr>
         <w:drawing>
           <wp:inline distT="0" distB="0" distL="0" distR="0" wp14:anchorId="15033989" wp14:editId="37C2F292">
             <wp:extent cx="5612130" cy="4383405"/>
@@ -2192,6 +2222,9 @@
     </w:p>
     <w:p>
       <w:r>
+        <w:rPr>
+          <w:noProof/>
+        </w:rPr>
         <w:lastRenderedPageBreak/>
         <w:drawing>
           <wp:inline distT="0" distB="0" distL="0" distR="0" wp14:anchorId="5722B179" wp14:editId="68FF5B27">
@@ -2233,6 +2266,9 @@
         <w:br/>
       </w:r>
       <w:r>
+        <w:rPr>
+          <w:noProof/>
+        </w:rPr>
         <w:drawing>
           <wp:inline distT="0" distB="0" distL="0" distR="0" wp14:anchorId="27440940" wp14:editId="7823B363">
             <wp:extent cx="5612130" cy="3891280"/>
@@ -2319,6 +2355,9 @@
         </w:rPr>
       </w:pPr>
       <w:r>
+        <w:rPr>
+          <w:noProof/>
+        </w:rPr>
         <w:drawing>
           <wp:inline distT="0" distB="0" distL="0" distR="0" wp14:anchorId="1902D721" wp14:editId="1D03BF0B">
             <wp:extent cx="5612130" cy="3162935"/>
@@ -2427,6 +2466,9 @@
         </w:rPr>
       </w:pPr>
       <w:r>
+        <w:rPr>
+          <w:noProof/>
+        </w:rPr>
         <w:drawing>
           <wp:inline distT="0" distB="0" distL="0" distR="0" wp14:anchorId="41AD895E" wp14:editId="397BB0A4">
             <wp:extent cx="5612130" cy="3135630"/>
@@ -2463,6 +2505,14 @@
           </wp:inline>
         </w:drawing>
       </w:r>
+    </w:p>
+    <w:p>
+      <w:pPr>
+        <w:rPr>
+          <w:b/>
+          <w:bCs/>
+        </w:rPr>
+      </w:pPr>
       <w:r>
         <w:rPr>
           <w:b/>
@@ -24869,6 +24919,7 @@
   <w:style w:type="character" w:default="1" w:styleId="Fuentedeprrafopredeter">
     <w:name w:val="Default Paragraph Font"/>
     <w:uiPriority w:val="1"/>
+    <w:semiHidden/>
     <w:unhideWhenUsed/>
   </w:style>
   <w:style w:type="table" w:default="1" w:styleId="Tablanormal">

</xml_diff>